<commit_message>
feat: add competition-ready report checking workflow
</commit_message>
<xml_diff>
--- a/docs/FinTrace-CN_研报纠错核查智能体_竞赛实施计划.docx
+++ b/docs/FinTrace-CN_研报纠错核查智能体_竞赛实施计划.docx
@@ -4056,7 +4056,7 @@
           <w:color w:val="000000"/>
           <w:sz w:val="30"/>
         </w:rPr>
-        <w:t>七 十天实施排期</w:t>
+        <w:t>七 冲刺实施排期</w:t>
       </w:r>
     </w:p>
     <w:tbl>
@@ -4179,477 +4179,6 @@
                 <w:b w:val="0"/>
                 <w:sz w:val="17"/>
               </w:rPr>
-              <w:t>10 月 8 日</w:t>
-            </w:r>
-          </w:p>
-        </w:tc>
-        <w:tc>
-          <w:tcPr>
-            <w:tcW w:type="dxa" w:w="4706"/>
-            <w:tcMar>
-              <w:top w:w="100" w:type="dxa"/>
-              <w:start w:w="120" w:type="dxa"/>
-              <w:bottom w:w="100" w:type="dxa"/>
-              <w:end w:w="120" w:type="dxa"/>
-            </w:tcMar>
-            <w:vAlign w:val="center"/>
-          </w:tcPr>
-          <w:p>
-            <w:pPr>
-              <w:spacing w:after="0" w:line="276" w:lineRule="auto"/>
-            </w:pPr>
-            <w:r>
-              <w:rPr>
-                <w:rFonts w:ascii="Aptos" w:hAnsi="Aptos" w:eastAsia="Microsoft YaHei"/>
-                <w:b w:val="0"/>
-                <w:sz w:val="17"/>
-              </w:rPr>
-              <w:t>冻结范围 保护现有改动 确定演示材料</w:t>
-            </w:r>
-          </w:p>
-        </w:tc>
-        <w:tc>
-          <w:tcPr>
-            <w:tcW w:type="dxa" w:w="3402"/>
-            <w:tcMar>
-              <w:top w:w="100" w:type="dxa"/>
-              <w:start w:w="120" w:type="dxa"/>
-              <w:bottom w:w="100" w:type="dxa"/>
-              <w:end w:w="120" w:type="dxa"/>
-            </w:tcMar>
-            <w:vAlign w:val="center"/>
-          </w:tcPr>
-          <w:p>
-            <w:pPr>
-              <w:spacing w:after="0" w:line="276" w:lineRule="auto"/>
-            </w:pPr>
-            <w:r>
-              <w:rPr>
-                <w:rFonts w:ascii="Aptos" w:hAnsi="Aptos" w:eastAsia="Microsoft YaHei"/>
-                <w:b w:val="0"/>
-                <w:sz w:val="17"/>
-              </w:rPr>
-              <w:t>范围说明与材料清单</w:t>
-            </w:r>
-          </w:p>
-        </w:tc>
-      </w:tr>
-      <w:tr>
-        <w:tc>
-          <w:tcPr>
-            <w:tcW w:type="dxa" w:w="1531"/>
-            <w:shd w:fill="F2F6FA"/>
-            <w:tcMar>
-              <w:top w:w="100" w:type="dxa"/>
-              <w:start w:w="120" w:type="dxa"/>
-              <w:bottom w:w="100" w:type="dxa"/>
-              <w:end w:w="120" w:type="dxa"/>
-            </w:tcMar>
-            <w:vAlign w:val="center"/>
-          </w:tcPr>
-          <w:p>
-            <w:pPr>
-              <w:spacing w:after="0" w:line="276" w:lineRule="auto"/>
-            </w:pPr>
-            <w:r>
-              <w:rPr>
-                <w:rFonts w:ascii="Aptos" w:hAnsi="Aptos" w:eastAsia="Microsoft YaHei"/>
-                <w:b w:val="0"/>
-                <w:sz w:val="17"/>
-              </w:rPr>
-              <w:t>10 月 9 日</w:t>
-            </w:r>
-          </w:p>
-        </w:tc>
-        <w:tc>
-          <w:tcPr>
-            <w:tcW w:type="dxa" w:w="4706"/>
-            <w:shd w:fill="F2F6FA"/>
-            <w:tcMar>
-              <w:top w:w="100" w:type="dxa"/>
-              <w:start w:w="120" w:type="dxa"/>
-              <w:bottom w:w="100" w:type="dxa"/>
-              <w:end w:w="120" w:type="dxa"/>
-            </w:tcMar>
-            <w:vAlign w:val="center"/>
-          </w:tcPr>
-          <w:p>
-            <w:pPr>
-              <w:spacing w:after="0" w:line="276" w:lineRule="auto"/>
-            </w:pPr>
-            <w:r>
-              <w:rPr>
-                <w:rFonts w:ascii="Aptos" w:hAnsi="Aptos" w:eastAsia="Microsoft YaHei"/>
-                <w:b w:val="0"/>
-                <w:sz w:val="17"/>
-              </w:rPr>
-              <w:t>固定端到端主流程和金标结果</w:t>
-            </w:r>
-          </w:p>
-        </w:tc>
-        <w:tc>
-          <w:tcPr>
-            <w:tcW w:type="dxa" w:w="3402"/>
-            <w:shd w:fill="F2F6FA"/>
-            <w:tcMar>
-              <w:top w:w="100" w:type="dxa"/>
-              <w:start w:w="120" w:type="dxa"/>
-              <w:bottom w:w="100" w:type="dxa"/>
-              <w:end w:w="120" w:type="dxa"/>
-            </w:tcMar>
-            <w:vAlign w:val="center"/>
-          </w:tcPr>
-          <w:p>
-            <w:pPr>
-              <w:spacing w:after="0" w:line="276" w:lineRule="auto"/>
-            </w:pPr>
-            <w:r>
-              <w:rPr>
-                <w:rFonts w:ascii="Aptos" w:hAnsi="Aptos" w:eastAsia="Microsoft YaHei"/>
-                <w:b w:val="0"/>
-                <w:sz w:val="17"/>
-              </w:rPr>
-              <w:t>一套可复跑案例</w:t>
-            </w:r>
-          </w:p>
-        </w:tc>
-      </w:tr>
-      <w:tr>
-        <w:tc>
-          <w:tcPr>
-            <w:tcW w:type="dxa" w:w="1531"/>
-            <w:tcMar>
-              <w:top w:w="100" w:type="dxa"/>
-              <w:start w:w="120" w:type="dxa"/>
-              <w:bottom w:w="100" w:type="dxa"/>
-              <w:end w:w="120" w:type="dxa"/>
-            </w:tcMar>
-            <w:vAlign w:val="center"/>
-          </w:tcPr>
-          <w:p>
-            <w:pPr>
-              <w:spacing w:after="0" w:line="276" w:lineRule="auto"/>
-            </w:pPr>
-            <w:r>
-              <w:rPr>
-                <w:rFonts w:ascii="Aptos" w:hAnsi="Aptos" w:eastAsia="Microsoft YaHei"/>
-                <w:b w:val="0"/>
-                <w:sz w:val="17"/>
-              </w:rPr>
-              <w:t>10 月 10 日</w:t>
-            </w:r>
-          </w:p>
-        </w:tc>
-        <w:tc>
-          <w:tcPr>
-            <w:tcW w:type="dxa" w:w="4706"/>
-            <w:tcMar>
-              <w:top w:w="100" w:type="dxa"/>
-              <w:start w:w="120" w:type="dxa"/>
-              <w:bottom w:w="100" w:type="dxa"/>
-              <w:end w:w="120" w:type="dxa"/>
-            </w:tcMar>
-            <w:vAlign w:val="center"/>
-          </w:tcPr>
-          <w:p>
-            <w:pPr>
-              <w:spacing w:after="0" w:line="276" w:lineRule="auto"/>
-            </w:pPr>
-            <w:r>
-              <w:rPr>
-                <w:rFonts w:ascii="Aptos" w:hAnsi="Aptos" w:eastAsia="Microsoft YaHei"/>
-                <w:b w:val="0"/>
-                <w:sz w:val="17"/>
-              </w:rPr>
-              <w:t>收敛 Agent 工具链与运行记录</w:t>
-            </w:r>
-          </w:p>
-        </w:tc>
-        <w:tc>
-          <w:tcPr>
-            <w:tcW w:type="dxa" w:w="3402"/>
-            <w:tcMar>
-              <w:top w:w="100" w:type="dxa"/>
-              <w:start w:w="120" w:type="dxa"/>
-              <w:bottom w:w="100" w:type="dxa"/>
-              <w:end w:w="120" w:type="dxa"/>
-            </w:tcMar>
-            <w:vAlign w:val="center"/>
-          </w:tcPr>
-          <w:p>
-            <w:pPr>
-              <w:spacing w:after="0" w:line="276" w:lineRule="auto"/>
-            </w:pPr>
-            <w:r>
-              <w:rPr>
-                <w:rFonts w:ascii="Aptos" w:hAnsi="Aptos" w:eastAsia="Microsoft YaHei"/>
-                <w:b w:val="0"/>
-                <w:sz w:val="17"/>
-              </w:rPr>
-              <w:t>工具列表和执行轨迹</w:t>
-            </w:r>
-          </w:p>
-        </w:tc>
-      </w:tr>
-      <w:tr>
-        <w:tc>
-          <w:tcPr>
-            <w:tcW w:type="dxa" w:w="1531"/>
-            <w:shd w:fill="F2F6FA"/>
-            <w:tcMar>
-              <w:top w:w="100" w:type="dxa"/>
-              <w:start w:w="120" w:type="dxa"/>
-              <w:bottom w:w="100" w:type="dxa"/>
-              <w:end w:w="120" w:type="dxa"/>
-            </w:tcMar>
-            <w:vAlign w:val="center"/>
-          </w:tcPr>
-          <w:p>
-            <w:pPr>
-              <w:spacing w:after="0" w:line="276" w:lineRule="auto"/>
-            </w:pPr>
-            <w:r>
-              <w:rPr>
-                <w:rFonts w:ascii="Aptos" w:hAnsi="Aptos" w:eastAsia="Microsoft YaHei"/>
-                <w:b w:val="0"/>
-                <w:sz w:val="17"/>
-              </w:rPr>
-              <w:t>10 月 11 日</w:t>
-            </w:r>
-          </w:p>
-        </w:tc>
-        <w:tc>
-          <w:tcPr>
-            <w:tcW w:type="dxa" w:w="4706"/>
-            <w:shd w:fill="F2F6FA"/>
-            <w:tcMar>
-              <w:top w:w="100" w:type="dxa"/>
-              <w:start w:w="120" w:type="dxa"/>
-              <w:bottom w:w="100" w:type="dxa"/>
-              <w:end w:w="120" w:type="dxa"/>
-            </w:tcMar>
-            <w:vAlign w:val="center"/>
-          </w:tcPr>
-          <w:p>
-            <w:pPr>
-              <w:spacing w:after="0" w:line="276" w:lineRule="auto"/>
-            </w:pPr>
-            <w:r>
-              <w:rPr>
-                <w:rFonts w:ascii="Aptos" w:hAnsi="Aptos" w:eastAsia="Microsoft YaHei"/>
-                <w:b w:val="0"/>
-                <w:sz w:val="17"/>
-              </w:rPr>
-              <w:t>完成结构化 CheckerReport</w:t>
-            </w:r>
-          </w:p>
-        </w:tc>
-        <w:tc>
-          <w:tcPr>
-            <w:tcW w:type="dxa" w:w="3402"/>
-            <w:shd w:fill="F2F6FA"/>
-            <w:tcMar>
-              <w:top w:w="100" w:type="dxa"/>
-              <w:start w:w="120" w:type="dxa"/>
-              <w:bottom w:w="100" w:type="dxa"/>
-              <w:end w:w="120" w:type="dxa"/>
-            </w:tcMar>
-            <w:vAlign w:val="center"/>
-          </w:tcPr>
-          <w:p>
-            <w:pPr>
-              <w:spacing w:after="0" w:line="276" w:lineRule="auto"/>
-            </w:pPr>
-            <w:r>
-              <w:rPr>
-                <w:rFonts w:ascii="Aptos" w:hAnsi="Aptos" w:eastAsia="Microsoft YaHei"/>
-                <w:b w:val="0"/>
-                <w:sz w:val="17"/>
-              </w:rPr>
-              <w:t>错误清单和 JSON 输出</w:t>
-            </w:r>
-          </w:p>
-        </w:tc>
-      </w:tr>
-      <w:tr>
-        <w:tc>
-          <w:tcPr>
-            <w:tcW w:type="dxa" w:w="1531"/>
-            <w:tcMar>
-              <w:top w:w="100" w:type="dxa"/>
-              <w:start w:w="120" w:type="dxa"/>
-              <w:bottom w:w="100" w:type="dxa"/>
-              <w:end w:w="120" w:type="dxa"/>
-            </w:tcMar>
-            <w:vAlign w:val="center"/>
-          </w:tcPr>
-          <w:p>
-            <w:pPr>
-              <w:spacing w:after="0" w:line="276" w:lineRule="auto"/>
-            </w:pPr>
-            <w:r>
-              <w:rPr>
-                <w:rFonts w:ascii="Aptos" w:hAnsi="Aptos" w:eastAsia="Microsoft YaHei"/>
-                <w:b w:val="0"/>
-                <w:sz w:val="17"/>
-              </w:rPr>
-              <w:t>10 月 12 日</w:t>
-            </w:r>
-          </w:p>
-        </w:tc>
-        <w:tc>
-          <w:tcPr>
-            <w:tcW w:type="dxa" w:w="4706"/>
-            <w:tcMar>
-              <w:top w:w="100" w:type="dxa"/>
-              <w:start w:w="120" w:type="dxa"/>
-              <w:bottom w:w="100" w:type="dxa"/>
-              <w:end w:w="120" w:type="dxa"/>
-            </w:tcMar>
-            <w:vAlign w:val="center"/>
-          </w:tcPr>
-          <w:p>
-            <w:pPr>
-              <w:spacing w:after="0" w:line="276" w:lineRule="auto"/>
-            </w:pPr>
-            <w:r>
-              <w:rPr>
-                <w:rFonts w:ascii="Aptos" w:hAnsi="Aptos" w:eastAsia="Microsoft YaHei"/>
-                <w:b w:val="0"/>
-                <w:sz w:val="17"/>
-              </w:rPr>
-              <w:t>完成证据与复算跳转</w:t>
-            </w:r>
-          </w:p>
-        </w:tc>
-        <w:tc>
-          <w:tcPr>
-            <w:tcW w:type="dxa" w:w="3402"/>
-            <w:tcMar>
-              <w:top w:w="100" w:type="dxa"/>
-              <w:start w:w="120" w:type="dxa"/>
-              <w:bottom w:w="100" w:type="dxa"/>
-              <w:end w:w="120" w:type="dxa"/>
-            </w:tcMar>
-            <w:vAlign w:val="center"/>
-          </w:tcPr>
-          <w:p>
-            <w:pPr>
-              <w:spacing w:after="0" w:line="276" w:lineRule="auto"/>
-            </w:pPr>
-            <w:r>
-              <w:rPr>
-                <w:rFonts w:ascii="Aptos" w:hAnsi="Aptos" w:eastAsia="Microsoft YaHei"/>
-                <w:b w:val="0"/>
-                <w:sz w:val="17"/>
-              </w:rPr>
-              <w:t>原句 页码 公式展示</w:t>
-            </w:r>
-          </w:p>
-        </w:tc>
-      </w:tr>
-      <w:tr>
-        <w:tc>
-          <w:tcPr>
-            <w:tcW w:type="dxa" w:w="1531"/>
-            <w:shd w:fill="F2F6FA"/>
-            <w:tcMar>
-              <w:top w:w="100" w:type="dxa"/>
-              <w:start w:w="120" w:type="dxa"/>
-              <w:bottom w:w="100" w:type="dxa"/>
-              <w:end w:w="120" w:type="dxa"/>
-            </w:tcMar>
-            <w:vAlign w:val="center"/>
-          </w:tcPr>
-          <w:p>
-            <w:pPr>
-              <w:spacing w:after="0" w:line="276" w:lineRule="auto"/>
-            </w:pPr>
-            <w:r>
-              <w:rPr>
-                <w:rFonts w:ascii="Aptos" w:hAnsi="Aptos" w:eastAsia="Microsoft YaHei"/>
-                <w:b w:val="0"/>
-                <w:sz w:val="17"/>
-              </w:rPr>
-              <w:t>10 月 13 日</w:t>
-            </w:r>
-          </w:p>
-        </w:tc>
-        <w:tc>
-          <w:tcPr>
-            <w:tcW w:type="dxa" w:w="4706"/>
-            <w:shd w:fill="F2F6FA"/>
-            <w:tcMar>
-              <w:top w:w="100" w:type="dxa"/>
-              <w:start w:w="120" w:type="dxa"/>
-              <w:bottom w:w="100" w:type="dxa"/>
-              <w:end w:w="120" w:type="dxa"/>
-            </w:tcMar>
-            <w:vAlign w:val="center"/>
-          </w:tcPr>
-          <w:p>
-            <w:pPr>
-              <w:spacing w:after="0" w:line="276" w:lineRule="auto"/>
-            </w:pPr>
-            <w:r>
-              <w:rPr>
-                <w:rFonts w:ascii="Aptos" w:hAnsi="Aptos" w:eastAsia="Microsoft YaHei"/>
-                <w:b w:val="0"/>
-                <w:sz w:val="17"/>
-              </w:rPr>
-              <w:t>收敛为五页竞赛 UI</w:t>
-            </w:r>
-          </w:p>
-        </w:tc>
-        <w:tc>
-          <w:tcPr>
-            <w:tcW w:type="dxa" w:w="3402"/>
-            <w:shd w:fill="F2F6FA"/>
-            <w:tcMar>
-              <w:top w:w="100" w:type="dxa"/>
-              <w:start w:w="120" w:type="dxa"/>
-              <w:bottom w:w="100" w:type="dxa"/>
-              <w:end w:w="120" w:type="dxa"/>
-            </w:tcMar>
-            <w:vAlign w:val="center"/>
-          </w:tcPr>
-          <w:p>
-            <w:pPr>
-              <w:spacing w:after="0" w:line="276" w:lineRule="auto"/>
-            </w:pPr>
-            <w:r>
-              <w:rPr>
-                <w:rFonts w:ascii="Aptos" w:hAnsi="Aptos" w:eastAsia="Microsoft YaHei"/>
-                <w:b w:val="0"/>
-                <w:sz w:val="17"/>
-              </w:rPr>
-              <w:t>竞赛版工作台</w:t>
-            </w:r>
-          </w:p>
-        </w:tc>
-      </w:tr>
-      <w:tr>
-        <w:tc>
-          <w:tcPr>
-            <w:tcW w:type="dxa" w:w="1531"/>
-            <w:tcMar>
-              <w:top w:w="100" w:type="dxa"/>
-              <w:start w:w="120" w:type="dxa"/>
-              <w:bottom w:w="100" w:type="dxa"/>
-              <w:end w:w="120" w:type="dxa"/>
-            </w:tcMar>
-            <w:vAlign w:val="center"/>
-          </w:tcPr>
-          <w:p>
-            <w:pPr>
-              <w:spacing w:after="0" w:line="276" w:lineRule="auto"/>
-            </w:pPr>
-            <w:r>
-              <w:rPr>
-                <w:rFonts w:ascii="Aptos" w:hAnsi="Aptos" w:eastAsia="Microsoft YaHei"/>
-                <w:b w:val="0"/>
-                <w:sz w:val="17"/>
-              </w:rPr>
               <w:t>10 月 14 日</w:t>
             </w:r>
           </w:p>
@@ -4675,7 +4204,7 @@
                 <w:b w:val="0"/>
                 <w:sz w:val="17"/>
               </w:rPr>
-              <w:t>完善审计记录与导出</w:t>
+              <w:t>冻结初赛范围，复核数值抽取与默认离线测试</w:t>
             </w:r>
           </w:p>
         </w:tc>
@@ -4700,7 +4229,7 @@
                 <w:b w:val="0"/>
                 <w:sz w:val="17"/>
               </w:rPr>
-              <w:t>Manifest 与 Markdown 导出</w:t>
+              <w:t>范围说明、测试记录与材料清单</w:t>
             </w:r>
           </w:p>
         </w:tc>
@@ -4754,7 +4283,7 @@
                 <w:b w:val="0"/>
                 <w:sz w:val="17"/>
               </w:rPr>
-              <w:t>离线测试 演示彩排 代码冻结</w:t>
+              <w:t>固定端到端主流程和金标结果，收敛 Agent 工具链与运行记录</w:t>
             </w:r>
           </w:p>
         </w:tc>
@@ -4780,7 +4309,7 @@
                 <w:b w:val="0"/>
                 <w:sz w:val="17"/>
               </w:rPr>
-              <w:t>测试记录和录屏候选版</w:t>
+              <w:t>一套可复跑案例、工具轨迹与结构化 CheckerReport</w:t>
             </w:r>
           </w:p>
         </w:tc>
@@ -4832,7 +4361,7 @@
                 <w:b w:val="0"/>
                 <w:sz w:val="17"/>
               </w:rPr>
-              <w:t>完成计划书和五分钟视频</w:t>
+              <w:t>完成证据与复算跳转，收敛为五页竞赛 UI</w:t>
             </w:r>
           </w:p>
         </w:tc>
@@ -4857,7 +4386,7 @@
                 <w:b w:val="0"/>
                 <w:sz w:val="17"/>
               </w:rPr>
-              <w:t>PDF 与视频初版</w:t>
+              <w:t>原句、页码、公式展示与竞赛版工作台</w:t>
             </w:r>
           </w:p>
         </w:tc>
@@ -4911,7 +4440,7 @@
                 <w:b w:val="0"/>
                 <w:sz w:val="17"/>
               </w:rPr>
-              <w:t>模拟答辩与提交检查</w:t>
+              <w:t>离线测试、演示彩排、计划书和五分钟视频定稿</w:t>
             </w:r>
           </w:p>
         </w:tc>
@@ -4937,7 +4466,7 @@
                 <w:b w:val="0"/>
                 <w:sz w:val="17"/>
               </w:rPr>
-              <w:t>最终源码包和材料</w:t>
+              <w:t>测试记录、最终源码包与视频</w:t>
             </w:r>
           </w:p>
         </w:tc>

</xml_diff>